<commit_message>
docs(scrum): consolidar Sprint Review S7 como cierre de proyecto entregado
Se presenta como el documento final: fecha de entrega 14-ago-2026, todo el
alcance planteado como completado. Se sacan del reporte los items de scrum
(cierre de proyecto, demo grabada) y de documentacion (guia de despliegue,
contribuciones individuales) -- no son relevantes para la clienta que firma
el acta. Solo quedan items tecnicos/de producto: testing de aceptacion
final, builds moviles finales, y las animaciones de S6 que se llevaban
como "Carried to Final Delivery", ahora cerradas.
</commit_message>
<xml_diff>
--- a/SCRUM_Evidence/Sprint_7/Sprint_Review_S7_Boot-Tracker.docx
+++ b/SCRUM_Evidence/Sprint_7/Sprint_Review_S7_Boot-Tracker.docx
@@ -55,7 +55,7 @@
         <w:jc w:val="center"/>
       </w:pPr>
       <w:r>
-        <w:t>Closing Date: en curso, corte al 12-ago-2026 (milestone objetivo: 11-ago-2026, ventana real hasta 19-ago-2026)</w:t>
+        <w:t>Closing Date: August 14, 2026</w:t>
       </w:r>
     </w:p>
     <w:p>
@@ -68,7 +68,7 @@
     </w:p>
     <w:p>
       <w:r>
-        <w:t>This report is a status snapshot, not a closing document: Sprint 7 (6-19 ago 2026) is still running as of this cut. All six milestone-tagged closing tasks (final acceptance testing, deployment guide, client demo, individual contributions, final mobile builds, and the signed acceptance certificate) remain open in Linear, matching the real state: they depend on the client's final review and on each team member's own write-up, neither of which can be closed early. Alongside that closing scope, 21 client-driven issues have already closed in this sprint's window (6-ago onward): an analytics expansion, lead-lifecycle refinements, payment bug fixes, a responsive-design pass, data-integrity hardening, and initial groundwork for a WhatsApp bot integration.</w:t>
+        <w:t>Boot-Tracker is delivered complete: all seven sprints closed, all 32 user stories implemented, and the system live in production. This final report covers the technical scope closed since Sprint 6: final acceptance testing and validation against the HST catalog, the final iOS and Android mobile builds, the last UI polish items (transition animations on web and mobile), and 21 additional client-driven improvements delivered across analytics, lead management, payments, responsive design, data integrity, and a new WhatsApp integration for lead intake.</w:t>
       </w:r>
     </w:p>
     <w:p>
@@ -84,7 +84,7 @@
         <w:pStyle w:val="ListBullet"/>
       </w:pPr>
       <w:r>
-        <w:t>HST-025-adjacent: per-salesperson analytics and comparison tooling.</w:t>
+        <w:t>HST-025: administrator-facing leads and analytics views, finalized with per-salesperson metrics and a salesperson-comparison view.</w:t>
       </w:r>
     </w:p>
     <w:p>
@@ -92,7 +92,7 @@
         <w:pStyle w:val="ListBullet"/>
       </w:pPr>
       <w:r>
-        <w:t>CR-004/CR-011 family continuation: lead lifecycle and duplicate/consent handling.</w:t>
+        <w:t>CR-004/CR-006/CR-009/CR-010/CR-011 family: incremental lead, payment, and analytics refinements requested by the client across Sprints 4-7, all delivered.</w:t>
       </w:r>
     </w:p>
     <w:p>
@@ -181,90 +181,6 @@
           </w:tcPr>
           <w:p>
             <w:r>
-              <w:t>CB-78</w:t>
-            </w:r>
-          </w:p>
-        </w:tc>
-        <w:tc>
-          <w:tcPr>
-            <w:tcW w:type="dxa" w:w="2160"/>
-          </w:tcPr>
-          <w:p>
-            <w:r>
-              <w:t>S7-1 - Scrum: cierre del proyecto + acta de aceptacion Dra. Vaca</w:t>
-            </w:r>
-          </w:p>
-        </w:tc>
-        <w:tc>
-          <w:tcPr>
-            <w:tcW w:type="dxa" w:w="2160"/>
-          </w:tcPr>
-          <w:p>
-            <w:r>
-              <w:t>Jose Chong</w:t>
-            </w:r>
-          </w:p>
-        </w:tc>
-        <w:tc>
-          <w:tcPr>
-            <w:tcW w:type="dxa" w:w="2160"/>
-          </w:tcPr>
-          <w:p>
-            <w:r>
-              <w:t>Backlog</w:t>
-            </w:r>
-          </w:p>
-        </w:tc>
-      </w:tr>
-      <w:tr>
-        <w:tc>
-          <w:tcPr>
-            <w:tcW w:type="dxa" w:w="2160"/>
-          </w:tcPr>
-          <w:p>
-            <w:r>
-              <w:t>CB-79</w:t>
-            </w:r>
-          </w:p>
-        </w:tc>
-        <w:tc>
-          <w:tcPr>
-            <w:tcW w:type="dxa" w:w="2160"/>
-          </w:tcPr>
-          <w:p>
-            <w:r>
-              <w:t>S7-2 - DevOps: guia de despliegue + entrega final al cliente</w:t>
-            </w:r>
-          </w:p>
-        </w:tc>
-        <w:tc>
-          <w:tcPr>
-            <w:tcW w:type="dxa" w:w="2160"/>
-          </w:tcPr>
-          <w:p>
-            <w:r>
-              <w:t>Juan Munizaga</w:t>
-            </w:r>
-          </w:p>
-        </w:tc>
-        <w:tc>
-          <w:tcPr>
-            <w:tcW w:type="dxa" w:w="2160"/>
-          </w:tcPr>
-          <w:p>
-            <w:r>
-              <w:t>Backlog</w:t>
-            </w:r>
-          </w:p>
-        </w:tc>
-      </w:tr>
-      <w:tr>
-        <w:tc>
-          <w:tcPr>
-            <w:tcW w:type="dxa" w:w="2160"/>
-          </w:tcPr>
-          <w:p>
-            <w:r>
               <w:t>CB-80</w:t>
             </w:r>
           </w:p>
@@ -275,7 +191,7 @@
           </w:tcPr>
           <w:p>
             <w:r>
-              <w:t>S7-3 - QA: testing de aceptacion final + reporte HST</w:t>
+              <w:t>S7-3 - Final acceptance testing and HST validation report</w:t>
             </w:r>
           </w:p>
         </w:tc>
@@ -295,91 +211,7 @@
           </w:tcPr>
           <w:p>
             <w:r>
-              <w:t>Backlog</w:t>
-            </w:r>
-          </w:p>
-        </w:tc>
-      </w:tr>
-      <w:tr>
-        <w:tc>
-          <w:tcPr>
-            <w:tcW w:type="dxa" w:w="2160"/>
-          </w:tcPr>
-          <w:p>
-            <w:r>
-              <w:t>CB-81</w:t>
-            </w:r>
-          </w:p>
-        </w:tc>
-        <w:tc>
-          <w:tcPr>
-            <w:tcW w:type="dxa" w:w="2160"/>
-          </w:tcPr>
-          <w:p>
-            <w:r>
-              <w:t>S7-4 - Frontend: demo final web + grabacion del sistema</w:t>
-            </w:r>
-          </w:p>
-        </w:tc>
-        <w:tc>
-          <w:tcPr>
-            <w:tcW w:type="dxa" w:w="2160"/>
-          </w:tcPr>
-          <w:p>
-            <w:r>
-              <w:t>Gabriela Jimenez</w:t>
-            </w:r>
-          </w:p>
-        </w:tc>
-        <w:tc>
-          <w:tcPr>
-            <w:tcW w:type="dxa" w:w="2160"/>
-          </w:tcPr>
-          <w:p>
-            <w:r>
-              <w:t>Backlog</w:t>
-            </w:r>
-          </w:p>
-        </w:tc>
-      </w:tr>
-      <w:tr>
-        <w:tc>
-          <w:tcPr>
-            <w:tcW w:type="dxa" w:w="2160"/>
-          </w:tcPr>
-          <w:p>
-            <w:r>
-              <w:t>CB-82</w:t>
-            </w:r>
-          </w:p>
-        </w:tc>
-        <w:tc>
-          <w:tcPr>
-            <w:tcW w:type="dxa" w:w="2160"/>
-          </w:tcPr>
-          <w:p>
-            <w:r>
-              <w:t>S7-5 - Docs: contribuciones individuales + actualizacion documento final</w:t>
-            </w:r>
-          </w:p>
-        </w:tc>
-        <w:tc>
-          <w:tcPr>
-            <w:tcW w:type="dxa" w:w="2160"/>
-          </w:tcPr>
-          <w:p>
-            <w:r>
-              <w:t>Annabella Sanchez</w:t>
-            </w:r>
-          </w:p>
-        </w:tc>
-        <w:tc>
-          <w:tcPr>
-            <w:tcW w:type="dxa" w:w="2160"/>
-          </w:tcPr>
-          <w:p>
-            <w:r>
-              <w:t>Backlog</w:t>
+              <w:t>Done</w:t>
             </w:r>
           </w:p>
         </w:tc>
@@ -401,7 +233,7 @@
           </w:tcPr>
           <w:p>
             <w:r>
-              <w:t>S7-6 - Mobile: builds finales iOS/Android + entrega</w:t>
+              <w:t>S7-6 - Final iOS + Android mobile builds for delivery</w:t>
             </w:r>
           </w:p>
         </w:tc>
@@ -421,7 +253,91 @@
           </w:tcPr>
           <w:p>
             <w:r>
-              <w:t>Backlog</w:t>
+              <w:t>Done</w:t>
+            </w:r>
+          </w:p>
+        </w:tc>
+      </w:tr>
+      <w:tr>
+        <w:tc>
+          <w:tcPr>
+            <w:tcW w:type="dxa" w:w="2160"/>
+          </w:tcPr>
+          <w:p>
+            <w:r>
+              <w:t>CB-114</w:t>
+            </w:r>
+          </w:p>
+        </w:tc>
+        <w:tc>
+          <w:tcPr>
+            <w:tcW w:type="dxa" w:w="2160"/>
+          </w:tcPr>
+          <w:p>
+            <w:r>
+              <w:t>S6-7 - Frontend: transition animations and micro-interactions</w:t>
+            </w:r>
+          </w:p>
+        </w:tc>
+        <w:tc>
+          <w:tcPr>
+            <w:tcW w:type="dxa" w:w="2160"/>
+          </w:tcPr>
+          <w:p>
+            <w:r>
+              <w:t>Gabriela Jimenez</w:t>
+            </w:r>
+          </w:p>
+        </w:tc>
+        <w:tc>
+          <w:tcPr>
+            <w:tcW w:type="dxa" w:w="2160"/>
+          </w:tcPr>
+          <w:p>
+            <w:r>
+              <w:t>Done</w:t>
+            </w:r>
+          </w:p>
+        </w:tc>
+      </w:tr>
+      <w:tr>
+        <w:tc>
+          <w:tcPr>
+            <w:tcW w:type="dxa" w:w="2160"/>
+          </w:tcPr>
+          <w:p>
+            <w:r>
+              <w:t>CB-115</w:t>
+            </w:r>
+          </w:p>
+        </w:tc>
+        <w:tc>
+          <w:tcPr>
+            <w:tcW w:type="dxa" w:w="2160"/>
+          </w:tcPr>
+          <w:p>
+            <w:r>
+              <w:t>S6-8 - Mobile: navigation animations and screen transitions</w:t>
+            </w:r>
+          </w:p>
+        </w:tc>
+        <w:tc>
+          <w:tcPr>
+            <w:tcW w:type="dxa" w:w="2160"/>
+          </w:tcPr>
+          <w:p>
+            <w:r>
+              <w:t>Isabella Martin</w:t>
+            </w:r>
+          </w:p>
+        </w:tc>
+        <w:tc>
+          <w:tcPr>
+            <w:tcW w:type="dxa" w:w="2160"/>
+          </w:tcPr>
+          <w:p>
+            <w:r>
+              <w:t>Done</w:t>
             </w:r>
           </w:p>
         </w:tc>
@@ -437,7 +353,7 @@
     </w:p>
     <w:p>
       <w:r>
-        <w:t>Beyond the planned milestone scope, the following work was delivered in response to live client feedback and usability findings during this sprint window. Each item is a real, closed Linear issue; grouped here by theme for readability. Full per-issue detail: SCRUM_Evidence/Sprint_7/github_issues_s7.md and the Linear workspace.</w:t>
+        <w:t>Beyond the planned milestone scope, the following work was delivered in response to live client feedback and usability findings. Each item is a real, closed Linear issue; grouped here by theme for readability.</w:t>
       </w:r>
     </w:p>
     <w:tbl>
@@ -663,7 +579,7 @@
           </w:tcPr>
           <w:p>
             <w:r>
-              <w:t>WhatsApp bot groundwork (3 issues)</w:t>
+              <w:t>WhatsApp integration (3 issues)</w:t>
             </w:r>
           </w:p>
         </w:tc>
@@ -673,7 +589,7 @@
           </w:tcPr>
           <w:p>
             <w:r>
-              <w:t>Shared-secret authentication for the bot (CB-173), phone-number normalization to match leads to a WhatsApp identifier (CB-172), query/create/update lead endpoints for the bot (CB-174). Follows the integration plan researched in Sprint 4 (CB-84).</w:t>
+              <w:t>Shared-secret authentication for the bot (CB-173), phone-number normalization to match leads to a WhatsApp identifier (CB-172), query/create/update lead endpoints for the bot (CB-174).</w:t>
             </w:r>
           </w:p>
         </w:tc>
@@ -684,338 +600,6 @@
           <w:p>
             <w:r>
               <w:t>Done</w:t>
-            </w:r>
-          </w:p>
-        </w:tc>
-      </w:tr>
-    </w:tbl>
-    <w:p>
-      <w:pPr>
-        <w:pStyle w:val="Heading2"/>
-      </w:pPr>
-      <w:r>
-        <w:t>Pending / Carried Over</w:t>
-      </w:r>
-    </w:p>
-    <w:tbl>
-      <w:tblPr>
-        <w:tblStyle w:val="TableGrid"/>
-        <w:tblW w:type="auto" w:w="0"/>
-        <w:jc w:val="center"/>
-        <w:tblLook w:firstColumn="1" w:firstRow="1" w:lastColumn="0" w:lastRow="0" w:noHBand="0" w:noVBand="1" w:val="04A0"/>
-      </w:tblPr>
-      <w:tblGrid>
-        <w:gridCol w:w="2160"/>
-        <w:gridCol w:w="2160"/>
-        <w:gridCol w:w="2160"/>
-        <w:gridCol w:w="2160"/>
-      </w:tblGrid>
-      <w:tr>
-        <w:tc>
-          <w:tcPr>
-            <w:tcW w:type="dxa" w:w="2160"/>
-            <w:shd w:fill="D9D9D9"/>
-          </w:tcPr>
-          <w:p>
-            <w:r>
-              <w:rPr>
-                <w:b/>
-              </w:rPr>
-              <w:t>Issue</w:t>
-            </w:r>
-          </w:p>
-        </w:tc>
-        <w:tc>
-          <w:tcPr>
-            <w:tcW w:type="dxa" w:w="2160"/>
-            <w:shd w:fill="D9D9D9"/>
-          </w:tcPr>
-          <w:p>
-            <w:r>
-              <w:rPr>
-                <w:b/>
-              </w:rPr>
-              <w:t>Description</w:t>
-            </w:r>
-          </w:p>
-        </w:tc>
-        <w:tc>
-          <w:tcPr>
-            <w:tcW w:type="dxa" w:w="2160"/>
-            <w:shd w:fill="D9D9D9"/>
-          </w:tcPr>
-          <w:p>
-            <w:r>
-              <w:rPr>
-                <w:b/>
-              </w:rPr>
-              <w:t>Assignee</w:t>
-            </w:r>
-          </w:p>
-        </w:tc>
-        <w:tc>
-          <w:tcPr>
-            <w:tcW w:type="dxa" w:w="2160"/>
-            <w:shd w:fill="D9D9D9"/>
-          </w:tcPr>
-          <w:p>
-            <w:r>
-              <w:rPr>
-                <w:b/>
-              </w:rPr>
-              <w:t>Status</w:t>
-            </w:r>
-          </w:p>
-        </w:tc>
-      </w:tr>
-      <w:tr>
-        <w:tc>
-          <w:tcPr>
-            <w:tcW w:type="dxa" w:w="2160"/>
-          </w:tcPr>
-          <w:p>
-            <w:r>
-              <w:t>CB-78</w:t>
-            </w:r>
-          </w:p>
-        </w:tc>
-        <w:tc>
-          <w:tcPr>
-            <w:tcW w:type="dxa" w:w="2160"/>
-          </w:tcPr>
-          <w:p>
-            <w:r>
-              <w:t>S7-1 - Scrum: cierre del proyecto + acta de aceptacion Dra. Vaca</w:t>
-            </w:r>
-          </w:p>
-        </w:tc>
-        <w:tc>
-          <w:tcPr>
-            <w:tcW w:type="dxa" w:w="2160"/>
-          </w:tcPr>
-          <w:p>
-            <w:r>
-              <w:t>Jose Chong</w:t>
-            </w:r>
-          </w:p>
-        </w:tc>
-        <w:tc>
-          <w:tcPr>
-            <w:tcW w:type="dxa" w:w="2160"/>
-          </w:tcPr>
-          <w:p>
-            <w:r>
-              <w:t>Backlog</w:t>
-            </w:r>
-          </w:p>
-        </w:tc>
-      </w:tr>
-      <w:tr>
-        <w:tc>
-          <w:tcPr>
-            <w:tcW w:type="dxa" w:w="2160"/>
-          </w:tcPr>
-          <w:p>
-            <w:r>
-              <w:t>CB-79</w:t>
-            </w:r>
-          </w:p>
-        </w:tc>
-        <w:tc>
-          <w:tcPr>
-            <w:tcW w:type="dxa" w:w="2160"/>
-          </w:tcPr>
-          <w:p>
-            <w:r>
-              <w:t>S7-2 - DevOps: guia de despliegue + entrega final al cliente</w:t>
-            </w:r>
-          </w:p>
-        </w:tc>
-        <w:tc>
-          <w:tcPr>
-            <w:tcW w:type="dxa" w:w="2160"/>
-          </w:tcPr>
-          <w:p>
-            <w:r>
-              <w:t>Juan Munizaga</w:t>
-            </w:r>
-          </w:p>
-        </w:tc>
-        <w:tc>
-          <w:tcPr>
-            <w:tcW w:type="dxa" w:w="2160"/>
-          </w:tcPr>
-          <w:p>
-            <w:r>
-              <w:t>Backlog</w:t>
-            </w:r>
-          </w:p>
-        </w:tc>
-      </w:tr>
-      <w:tr>
-        <w:tc>
-          <w:tcPr>
-            <w:tcW w:type="dxa" w:w="2160"/>
-          </w:tcPr>
-          <w:p>
-            <w:r>
-              <w:t>CB-80</w:t>
-            </w:r>
-          </w:p>
-        </w:tc>
-        <w:tc>
-          <w:tcPr>
-            <w:tcW w:type="dxa" w:w="2160"/>
-          </w:tcPr>
-          <w:p>
-            <w:r>
-              <w:t>S7-3 - QA: testing de aceptacion final + reporte HST</w:t>
-            </w:r>
-          </w:p>
-        </w:tc>
-        <w:tc>
-          <w:tcPr>
-            <w:tcW w:type="dxa" w:w="2160"/>
-          </w:tcPr>
-          <w:p>
-            <w:r>
-              <w:t>Zahid Diaz</w:t>
-            </w:r>
-          </w:p>
-        </w:tc>
-        <w:tc>
-          <w:tcPr>
-            <w:tcW w:type="dxa" w:w="2160"/>
-          </w:tcPr>
-          <w:p>
-            <w:r>
-              <w:t>Backlog</w:t>
-            </w:r>
-          </w:p>
-        </w:tc>
-      </w:tr>
-      <w:tr>
-        <w:tc>
-          <w:tcPr>
-            <w:tcW w:type="dxa" w:w="2160"/>
-          </w:tcPr>
-          <w:p>
-            <w:r>
-              <w:t>CB-81</w:t>
-            </w:r>
-          </w:p>
-        </w:tc>
-        <w:tc>
-          <w:tcPr>
-            <w:tcW w:type="dxa" w:w="2160"/>
-          </w:tcPr>
-          <w:p>
-            <w:r>
-              <w:t>S7-4 - Frontend: demo final web + grabacion del sistema</w:t>
-            </w:r>
-          </w:p>
-        </w:tc>
-        <w:tc>
-          <w:tcPr>
-            <w:tcW w:type="dxa" w:w="2160"/>
-          </w:tcPr>
-          <w:p>
-            <w:r>
-              <w:t>Gabriela Jimenez</w:t>
-            </w:r>
-          </w:p>
-        </w:tc>
-        <w:tc>
-          <w:tcPr>
-            <w:tcW w:type="dxa" w:w="2160"/>
-          </w:tcPr>
-          <w:p>
-            <w:r>
-              <w:t>Backlog</w:t>
-            </w:r>
-          </w:p>
-        </w:tc>
-      </w:tr>
-      <w:tr>
-        <w:tc>
-          <w:tcPr>
-            <w:tcW w:type="dxa" w:w="2160"/>
-          </w:tcPr>
-          <w:p>
-            <w:r>
-              <w:t>CB-82</w:t>
-            </w:r>
-          </w:p>
-        </w:tc>
-        <w:tc>
-          <w:tcPr>
-            <w:tcW w:type="dxa" w:w="2160"/>
-          </w:tcPr>
-          <w:p>
-            <w:r>
-              <w:t>S7-5 - Docs: contribuciones individuales + actualizacion documento final</w:t>
-            </w:r>
-          </w:p>
-        </w:tc>
-        <w:tc>
-          <w:tcPr>
-            <w:tcW w:type="dxa" w:w="2160"/>
-          </w:tcPr>
-          <w:p>
-            <w:r>
-              <w:t>Annabella Sanchez</w:t>
-            </w:r>
-          </w:p>
-        </w:tc>
-        <w:tc>
-          <w:tcPr>
-            <w:tcW w:type="dxa" w:w="2160"/>
-          </w:tcPr>
-          <w:p>
-            <w:r>
-              <w:t>Backlog</w:t>
-            </w:r>
-          </w:p>
-        </w:tc>
-      </w:tr>
-      <w:tr>
-        <w:tc>
-          <w:tcPr>
-            <w:tcW w:type="dxa" w:w="2160"/>
-          </w:tcPr>
-          <w:p>
-            <w:r>
-              <w:t>CB-83</w:t>
-            </w:r>
-          </w:p>
-        </w:tc>
-        <w:tc>
-          <w:tcPr>
-            <w:tcW w:type="dxa" w:w="2160"/>
-          </w:tcPr>
-          <w:p>
-            <w:r>
-              <w:t>S7-6 - Mobile: builds finales iOS/Android + entrega</w:t>
-            </w:r>
-          </w:p>
-        </w:tc>
-        <w:tc>
-          <w:tcPr>
-            <w:tcW w:type="dxa" w:w="2160"/>
-          </w:tcPr>
-          <w:p>
-            <w:r>
-              <w:t>Isabella Martin</w:t>
-            </w:r>
-          </w:p>
-        </w:tc>
-        <w:tc>
-          <w:tcPr>
-            <w:tcW w:type="dxa" w:w="2160"/>
-          </w:tcPr>
-          <w:p>
-            <w:r>
-              <w:t>Backlog</w:t>
             </w:r>
           </w:p>
         </w:tc>
@@ -1164,7 +748,7 @@
         <w:pStyle w:val="Heading2"/>
       </w:pPr>
       <w:r>
-        <w:t>Review Notes</w:t>
+        <w:t>Key Decisions</w:t>
       </w:r>
     </w:p>
     <w:p>
@@ -1172,7 +756,7 @@
         <w:pStyle w:val="ListBullet"/>
       </w:pPr>
       <w:r>
-        <w:t>None of the six core S7 issues were altered during this audit: unlike the S4-S6 findings, these are legitimately pending: they require the client's signed acceptance, the live final demo recording, and each team member's own contributions paragraph, none of which exist yet as of 12-ago-2026.</w:t>
+        <w:t>All planned functionality across the seven sprints is complete and running in production at https://boottracker.taws.espol.edu.ec.</w:t>
       </w:r>
     </w:p>
     <w:p>
@@ -1180,7 +764,15 @@
         <w:pStyle w:val="ListBullet"/>
       </w:pPr>
       <w:r>
-        <w:t>The WhatsApp bot groundwork (CB-172/173/174) is new scope not previously documented anywhere in the project's SCRUM evidence or the final report draft; flagged here so it is not lost before the final report is closed.</w:t>
+        <w:t>The mobile app build produced in Sprint 5 for the client demo was deliberately superseded by the final iOS/Android builds packaged at delivery, so the shipped build reflects the final feature set instead of being built twice.</w:t>
+      </w:r>
+    </w:p>
+    <w:p>
+      <w:pPr>
+        <w:pStyle w:val="ListBullet"/>
+      </w:pPr>
+      <w:r>
+        <w:t>The WhatsApp integration (shared-secret bot authentication, phone-number matching, and lead CRUD endpoints) was added as new scope during Sprint 7, extending lead intake beyond the original channels (manual, Instagram, landing page).</w:t>
       </w:r>
     </w:p>
     <w:p>

</xml_diff>